<commit_message>
Push notification: apply the PO's updated feedback of 06/10
Email rows re-cut to her text: item 3 deep-linking deferred to the next
phase (Avanza API structure only), item 10 retry rule to be confirmed
by RB Business, items 11/12/14 N/A (technical / outside the business
BRD), items 1 and 15 reworded, item 13 checklist reference dropped,
S1/S8 no longer point at a deep-link table.

BRD V1.2 aligned so document and email match: destinations section
removed (3.4-3.6 renumbered), retry back to X/N with a red "to be
confirmed by RB Business", figures back to X/N, acceptance-criteria
section removed, Future enhancements becomes section 8. 12 pages.

Co-Authored-By: Claude Fable 5 <noreply@anthropic.com>
Claude-Session: https://claude.ai/code/session_01Gsr2gRNUjiFkvLbYu9J5cW
</commit_message>
<xml_diff>
--- a/docs/brd/push_notification/BRD_Push_Notification_V1.2.docx
+++ b/docs/brd/push_notification/BRD_Push_Notification_V1.2.docx
@@ -609,7 +609,7 @@
                 <w:sz w:val="18"/>
                 <w:szCs w:val="18"/>
               </w:rPr>
-              <w:t xml:space="preserve">Business review of 29/09 incorporated: updated wording for P01, P04, P05 and P09; tap behaviour and destination screens; device and session scenarios; reminder stop rules and sending time; retry baseline and error codes per middleware specification v0.2 (05/10); duplicate-prevention rule BR5; acceptance criteria; future enhancements (post-MVP, dedicated development team)</w:t>
+              <w:t xml:space="preserve">Business review of 29/09 incorporated: updated wording for P01, P04, P05 and P09; device and session scenarios; reminder stop rules and sending time; middleware specification v0.2 values and error codes (05/10), retry values to be confirmed by Business; duplicate-prevention rule BR5; future enhancements (post-MVP, dedicated development team)</w:t>
             </w:r>
           </w:p>
         </w:tc>
@@ -700,7 +700,7 @@
       </w:hyperlink>
       <w:r>
         <w:tab/>
-        <w:t>7</w:t>
+        <w:t>6</w:t>
       </w:r>
     </w:p>
     <w:p>
@@ -717,7 +717,7 @@
       </w:hyperlink>
       <w:r>
         <w:tab/>
-        <w:t>10</w:t>
+        <w:t>9</w:t>
       </w:r>
     </w:p>
     <w:p>
@@ -734,7 +734,7 @@
       </w:hyperlink>
       <w:r>
         <w:tab/>
-        <w:t>10</w:t>
+        <w:t>9</w:t>
       </w:r>
     </w:p>
     <w:p>
@@ -751,7 +751,7 @@
       </w:hyperlink>
       <w:r>
         <w:tab/>
-        <w:t>11</w:t>
+        <w:t>10</w:t>
       </w:r>
     </w:p>
     <w:p>
@@ -763,29 +763,12 @@
       </w:pPr>
       <w:hyperlink w:anchor="sec14" w:history="1">
         <w:r>
-          <w:t>8. ACCEPTANCE CRITERIA (UAT)</w:t>
+          <w:t>8. FUTURE ENHANCEMENTS (POST-MVP)</w:t>
         </w:r>
       </w:hyperlink>
       <w:r>
         <w:tab/>
-        <w:t>12</w:t>
-      </w:r>
-    </w:p>
-    <w:p>
-      <w:pPr>
-        <w:tabs>
-          <w:tab w:val="right" w:leader="dot" w:pos="9640"/>
-        </w:tabs>
-        <w:spacing w:after="100"/>
-      </w:pPr>
-      <w:hyperlink w:anchor="sec15" w:history="1">
-        <w:r>
-          <w:t>9. FUTURE ENHANCEMENTS (POST-MVP)</w:t>
-        </w:r>
-      </w:hyperlink>
-      <w:r>
-        <w:tab/>
-        <w:t>13</w:t>
+        <w:t>11</w:t>
       </w:r>
     </w:p>
     <w:p>
@@ -802,7 +785,7 @@
       </w:hyperlink>
       <w:r>
         <w:tab/>
-        <w:t>14</w:t>
+        <w:t>12</w:t>
       </w:r>
     </w:p>
     <w:p>
@@ -1164,7 +1147,7 @@
           <w:i/>
           <w:iCs/>
         </w:rPr>
-        <w:t xml:space="preserve"> Business-managed configuration and Super Portal visibility are planned as post-MVP enhancements (section 9).</w:t>
+        <w:t xml:space="preserve"> Business-managed configuration and Super Portal visibility are planned as post-MVP enhancements (section 8).</w:t>
       </w:r>
     </w:p>
     <w:p>
@@ -3376,1173 +3359,7 @@
         <w:pStyle w:val="Heading2"/>
       </w:pPr>
       <w:r>
-        <w:t xml:space="preserve">3.4 Tap behaviour and destination screens</w:t>
-      </w:r>
-    </w:p>
-    <w:p>
-      <w:pPr>
-        <w:spacing w:after="130"/>
-      </w:pPr>
-      <w:r>
-        <w:t xml:space="preserve">Every push carries an action type (section 4.3). APPRO_JOURNEY opens the Appro journey at the destination screen below. NONE — used for P03 and P09, per the alignment call of 05/10 — opens the Super App without forcing a screen. If the customer is logged out, the Super App completes the login first, then opens the destination screen.</w:t>
-      </w:r>
-    </w:p>
-    <w:tbl>
-      <w:tblPr>
-        <w:tblW w:w="9640" w:type="dxa"/>
-        <w:tblBorders>
-          <w:top w:val="single" w:sz="4" w:space="0" w:color="A6A6A6"/>
-          <w:left w:val="single" w:sz="4" w:space="0" w:color="A6A6A6"/>
-          <w:bottom w:val="single" w:sz="4" w:space="0" w:color="A6A6A6"/>
-          <w:right w:val="single" w:sz="4" w:space="0" w:color="A6A6A6"/>
-          <w:insideH w:val="single" w:sz="4" w:space="0" w:color="A6A6A6"/>
-          <w:insideV w:val="single" w:sz="4" w:space="0" w:color="A6A6A6"/>
-        </w:tblBorders>
-        <w:tblCellMar>
-          <w:left w:w="10" w:type="dxa"/>
-          <w:right w:w="10" w:type="dxa"/>
-        </w:tblCellMar>
-        <w:tblLook w:val="04A0" w:firstRow="1" w:lastRow="0" w:firstColumn="1" w:lastColumn="0" w:noHBand="0" w:noVBand="1"/>
-      </w:tblPr>
-      <w:tblGrid>
-        <w:gridCol w:w="1250"/>
-        <w:gridCol w:w="2050"/>
-        <w:gridCol w:w="3400"/>
-        <w:gridCol w:w="2940"/>
-      </w:tblGrid>
-      <w:tr>
-        <w:tblPrEx>
-          <w:tblCellMar>
-            <w:top w:w="0" w:type="dxa"/>
-            <w:bottom w:w="0" w:type="dxa"/>
-          </w:tblCellMar>
-        </w:tblPrEx>
-        <w:trPr>
-          <w:cantSplit/>
-          <w:tblHeader/>
-        </w:trPr>
-        <w:tc>
-          <w:tcPr>
-            <w:tcW w:w="1250" w:type="dxa"/>
-            <w:shd w:val="clear" w:color="auto" w:fill="156082"/>
-            <w:tcMar>
-              <w:top w:w="70" w:type="dxa"/>
-              <w:left w:w="100" w:type="dxa"/>
-              <w:bottom w:w="70" w:type="dxa"/>
-              <w:right w:w="100" w:type="dxa"/>
-            </w:tcMar>
-            <w:vAlign w:val="center"/>
-          </w:tcPr>
-          <w:p>
-            <w:r>
-              <w:rPr>
-                <w:b/>
-                <w:bCs/>
-                <w:color w:val="FFFFFF"/>
-                <w:sz w:val="18"/>
-                <w:szCs w:val="18"/>
-              </w:rPr>
-              <w:t>Push ID</w:t>
-            </w:r>
-          </w:p>
-        </w:tc>
-        <w:tc>
-          <w:tcPr>
-            <w:tcW w:w="2050" w:type="dxa"/>
-            <w:shd w:val="clear" w:color="auto" w:fill="156082"/>
-            <w:tcMar>
-              <w:top w:w="70" w:type="dxa"/>
-              <w:left w:w="100" w:type="dxa"/>
-              <w:bottom w:w="70" w:type="dxa"/>
-              <w:right w:w="100" w:type="dxa"/>
-            </w:tcMar>
-            <w:vAlign w:val="center"/>
-          </w:tcPr>
-          <w:p>
-            <w:r>
-              <w:rPr>
-                <w:b/>
-                <w:bCs/>
-                <w:color w:val="FFFFFF"/>
-                <w:sz w:val="18"/>
-                <w:szCs w:val="18"/>
-              </w:rPr>
-              <w:t>Action type</w:t>
-            </w:r>
-          </w:p>
-        </w:tc>
-        <w:tc>
-          <w:tcPr>
-            <w:tcW w:w="3400" w:type="dxa"/>
-            <w:shd w:val="clear" w:color="auto" w:fill="156082"/>
-            <w:tcMar>
-              <w:top w:w="70" w:type="dxa"/>
-              <w:left w:w="100" w:type="dxa"/>
-              <w:bottom w:w="70" w:type="dxa"/>
-              <w:right w:w="100" w:type="dxa"/>
-            </w:tcMar>
-            <w:vAlign w:val="center"/>
-          </w:tcPr>
-          <w:p>
-            <w:r>
-              <w:rPr>
-                <w:b/>
-                <w:bCs/>
-                <w:color w:val="FFFFFF"/>
-                <w:sz w:val="18"/>
-                <w:szCs w:val="18"/>
-              </w:rPr>
-              <w:t>On tap, opens at</w:t>
-            </w:r>
-          </w:p>
-        </w:tc>
-        <w:tc>
-          <w:tcPr>
-            <w:tcW w:w="2940" w:type="dxa"/>
-            <w:shd w:val="clear" w:color="auto" w:fill="156082"/>
-            <w:tcMar>
-              <w:top w:w="70" w:type="dxa"/>
-              <w:left w:w="100" w:type="dxa"/>
-              <w:bottom w:w="70" w:type="dxa"/>
-              <w:right w:w="100" w:type="dxa"/>
-            </w:tcMar>
-            <w:vAlign w:val="center"/>
-          </w:tcPr>
-          <w:p>
-            <w:r>
-              <w:rPr>
-                <w:b/>
-                <w:bCs/>
-                <w:color w:val="FFFFFF"/>
-                <w:sz w:val="18"/>
-                <w:szCs w:val="18"/>
-              </w:rPr>
-              <w:t>If no longer active</w:t>
-            </w:r>
-          </w:p>
-        </w:tc>
-      </w:tr>
-      <w:tr>
-        <w:tblPrEx>
-          <w:tblCellMar>
-            <w:top w:w="0" w:type="dxa"/>
-            <w:bottom w:w="0" w:type="dxa"/>
-          </w:tblCellMar>
-        </w:tblPrEx>
-        <w:trPr>
-          <w:cantSplit/>
-        </w:trPr>
-        <w:tc>
-          <w:tcPr>
-            <w:tcW w:w="1250" w:type="dxa"/>
-            <w:tcMar>
-              <w:top w:w="70" w:type="dxa"/>
-              <w:left w:w="100" w:type="dxa"/>
-              <w:bottom w:w="70" w:type="dxa"/>
-              <w:right w:w="100" w:type="dxa"/>
-            </w:tcMar>
-          </w:tcPr>
-          <w:p>
-            <w:r>
-              <w:rPr>
-                <w:sz w:val="18"/>
-                <w:szCs w:val="18"/>
-              </w:rPr>
-              <w:t xml:space="preserve">P01</w:t>
-            </w:r>
-          </w:p>
-        </w:tc>
-        <w:tc>
-          <w:tcPr>
-            <w:tcW w:w="2050" w:type="dxa"/>
-            <w:tcMar>
-              <w:top w:w="70" w:type="dxa"/>
-              <w:left w:w="100" w:type="dxa"/>
-              <w:bottom w:w="70" w:type="dxa"/>
-              <w:right w:w="100" w:type="dxa"/>
-            </w:tcMar>
-          </w:tcPr>
-          <w:p>
-            <w:r>
-              <w:rPr>
-                <w:sz w:val="18"/>
-                <w:szCs w:val="18"/>
-              </w:rPr>
-              <w:t xml:space="preserve">APPRO_JOURNEY</w:t>
-            </w:r>
-          </w:p>
-        </w:tc>
-        <w:tc>
-          <w:tcPr>
-            <w:tcW w:w="3400" w:type="dxa"/>
-            <w:tcMar>
-              <w:top w:w="70" w:type="dxa"/>
-              <w:left w:w="100" w:type="dxa"/>
-              <w:bottom w:w="70" w:type="dxa"/>
-              <w:right w:w="100" w:type="dxa"/>
-            </w:tcMar>
-          </w:tcPr>
-          <w:p>
-            <w:r>
-              <w:rPr>
-                <w:sz w:val="18"/>
-                <w:szCs w:val="18"/>
-              </w:rPr>
-              <w:t xml:space="preserve">Offer review screen</w:t>
-            </w:r>
-          </w:p>
-        </w:tc>
-        <w:tc>
-          <w:tcPr>
-            <w:tcW w:w="2940" w:type="dxa"/>
-            <w:tcMar>
-              <w:top w:w="70" w:type="dxa"/>
-              <w:left w:w="100" w:type="dxa"/>
-              <w:bottom w:w="70" w:type="dxa"/>
-              <w:right w:w="100" w:type="dxa"/>
-            </w:tcMar>
-          </w:tcPr>
-          <w:p>
-            <w:r>
-              <w:rPr>
-                <w:sz w:val="18"/>
-                <w:szCs w:val="18"/>
-              </w:rPr>
-              <w:t xml:space="preserve">Application status screen</w:t>
-            </w:r>
-          </w:p>
-        </w:tc>
-      </w:tr>
-      <w:tr>
-        <w:tblPrEx>
-          <w:tblCellMar>
-            <w:top w:w="0" w:type="dxa"/>
-            <w:bottom w:w="0" w:type="dxa"/>
-          </w:tblCellMar>
-        </w:tblPrEx>
-        <w:trPr>
-          <w:cantSplit/>
-        </w:trPr>
-        <w:tc>
-          <w:tcPr>
-            <w:tcW w:w="1250" w:type="dxa"/>
-            <w:tcMar>
-              <w:top w:w="70" w:type="dxa"/>
-              <w:left w:w="100" w:type="dxa"/>
-              <w:bottom w:w="70" w:type="dxa"/>
-              <w:right w:w="100" w:type="dxa"/>
-            </w:tcMar>
-          </w:tcPr>
-          <w:p>
-            <w:r>
-              <w:rPr>
-                <w:sz w:val="18"/>
-                <w:szCs w:val="18"/>
-              </w:rPr>
-              <w:t xml:space="preserve">P01 (CASA)</w:t>
-            </w:r>
-          </w:p>
-        </w:tc>
-        <w:tc>
-          <w:tcPr>
-            <w:tcW w:w="2050" w:type="dxa"/>
-            <w:tcMar>
-              <w:top w:w="70" w:type="dxa"/>
-              <w:left w:w="100" w:type="dxa"/>
-              <w:bottom w:w="70" w:type="dxa"/>
-              <w:right w:w="100" w:type="dxa"/>
-            </w:tcMar>
-          </w:tcPr>
-          <w:p>
-            <w:r>
-              <w:rPr>
-                <w:sz w:val="18"/>
-                <w:szCs w:val="18"/>
-              </w:rPr>
-              <w:t xml:space="preserve">APPRO_JOURNEY</w:t>
-            </w:r>
-          </w:p>
-        </w:tc>
-        <w:tc>
-          <w:tcPr>
-            <w:tcW w:w="3400" w:type="dxa"/>
-            <w:tcMar>
-              <w:top w:w="70" w:type="dxa"/>
-              <w:left w:w="100" w:type="dxa"/>
-              <w:bottom w:w="70" w:type="dxa"/>
-              <w:right w:w="100" w:type="dxa"/>
-            </w:tcMar>
-          </w:tcPr>
-          <w:p>
-            <w:r>
-              <w:rPr>
-                <w:sz w:val="18"/>
-                <w:szCs w:val="18"/>
-              </w:rPr>
-              <w:t xml:space="preserve">Account opening continuation screen</w:t>
-            </w:r>
-          </w:p>
-        </w:tc>
-        <w:tc>
-          <w:tcPr>
-            <w:tcW w:w="2940" w:type="dxa"/>
-            <w:tcMar>
-              <w:top w:w="70" w:type="dxa"/>
-              <w:left w:w="100" w:type="dxa"/>
-              <w:bottom w:w="70" w:type="dxa"/>
-              <w:right w:w="100" w:type="dxa"/>
-            </w:tcMar>
-          </w:tcPr>
-          <w:p>
-            <w:r>
-              <w:rPr>
-                <w:sz w:val="18"/>
-                <w:szCs w:val="18"/>
-              </w:rPr>
-              <w:t xml:space="preserve">Application status screen</w:t>
-            </w:r>
-          </w:p>
-        </w:tc>
-      </w:tr>
-      <w:tr>
-        <w:tblPrEx>
-          <w:tblCellMar>
-            <w:top w:w="0" w:type="dxa"/>
-            <w:bottom w:w="0" w:type="dxa"/>
-          </w:tblCellMar>
-        </w:tblPrEx>
-        <w:trPr>
-          <w:cantSplit/>
-        </w:trPr>
-        <w:tc>
-          <w:tcPr>
-            <w:tcW w:w="1250" w:type="dxa"/>
-            <w:tcMar>
-              <w:top w:w="70" w:type="dxa"/>
-              <w:left w:w="100" w:type="dxa"/>
-              <w:bottom w:w="70" w:type="dxa"/>
-              <w:right w:w="100" w:type="dxa"/>
-            </w:tcMar>
-          </w:tcPr>
-          <w:p>
-            <w:r>
-              <w:rPr>
-                <w:sz w:val="18"/>
-                <w:szCs w:val="18"/>
-              </w:rPr>
-              <w:t xml:space="preserve">P02</w:t>
-            </w:r>
-          </w:p>
-        </w:tc>
-        <w:tc>
-          <w:tcPr>
-            <w:tcW w:w="2050" w:type="dxa"/>
-            <w:tcMar>
-              <w:top w:w="70" w:type="dxa"/>
-              <w:left w:w="100" w:type="dxa"/>
-              <w:bottom w:w="70" w:type="dxa"/>
-              <w:right w:w="100" w:type="dxa"/>
-            </w:tcMar>
-          </w:tcPr>
-          <w:p>
-            <w:r>
-              <w:rPr>
-                <w:sz w:val="18"/>
-                <w:szCs w:val="18"/>
-              </w:rPr>
-              <w:t xml:space="preserve">APPRO_JOURNEY</w:t>
-            </w:r>
-          </w:p>
-        </w:tc>
-        <w:tc>
-          <w:tcPr>
-            <w:tcW w:w="3400" w:type="dxa"/>
-            <w:tcMar>
-              <w:top w:w="70" w:type="dxa"/>
-              <w:left w:w="100" w:type="dxa"/>
-              <w:bottom w:w="70" w:type="dxa"/>
-              <w:right w:w="100" w:type="dxa"/>
-            </w:tcMar>
-          </w:tcPr>
-          <w:p>
-            <w:r>
-              <w:rPr>
-                <w:sz w:val="18"/>
-                <w:szCs w:val="18"/>
-              </w:rPr>
-              <w:t xml:space="preserve">Offer review screen</w:t>
-            </w:r>
-          </w:p>
-        </w:tc>
-        <w:tc>
-          <w:tcPr>
-            <w:tcW w:w="2940" w:type="dxa"/>
-            <w:tcMar>
-              <w:top w:w="70" w:type="dxa"/>
-              <w:left w:w="100" w:type="dxa"/>
-              <w:bottom w:w="70" w:type="dxa"/>
-              <w:right w:w="100" w:type="dxa"/>
-            </w:tcMar>
-          </w:tcPr>
-          <w:p>
-            <w:r>
-              <w:rPr>
-                <w:sz w:val="18"/>
-                <w:szCs w:val="18"/>
-              </w:rPr>
-              <w:t xml:space="preserve">Application status screen</w:t>
-            </w:r>
-          </w:p>
-        </w:tc>
-      </w:tr>
-      <w:tr>
-        <w:tblPrEx>
-          <w:tblCellMar>
-            <w:top w:w="0" w:type="dxa"/>
-            <w:bottom w:w="0" w:type="dxa"/>
-          </w:tblCellMar>
-        </w:tblPrEx>
-        <w:trPr>
-          <w:cantSplit/>
-        </w:trPr>
-        <w:tc>
-          <w:tcPr>
-            <w:tcW w:w="1250" w:type="dxa"/>
-            <w:tcMar>
-              <w:top w:w="70" w:type="dxa"/>
-              <w:left w:w="100" w:type="dxa"/>
-              <w:bottom w:w="70" w:type="dxa"/>
-              <w:right w:w="100" w:type="dxa"/>
-            </w:tcMar>
-          </w:tcPr>
-          <w:p>
-            <w:r>
-              <w:rPr>
-                <w:sz w:val="18"/>
-                <w:szCs w:val="18"/>
-              </w:rPr>
-              <w:t xml:space="preserve">P03</w:t>
-            </w:r>
-          </w:p>
-        </w:tc>
-        <w:tc>
-          <w:tcPr>
-            <w:tcW w:w="2050" w:type="dxa"/>
-            <w:tcMar>
-              <w:top w:w="70" w:type="dxa"/>
-              <w:left w:w="100" w:type="dxa"/>
-              <w:bottom w:w="70" w:type="dxa"/>
-              <w:right w:w="100" w:type="dxa"/>
-            </w:tcMar>
-          </w:tcPr>
-          <w:p>
-            <w:r>
-              <w:rPr>
-                <w:sz w:val="18"/>
-                <w:szCs w:val="18"/>
-              </w:rPr>
-              <w:t xml:space="preserve">NONE</w:t>
-            </w:r>
-          </w:p>
-        </w:tc>
-        <w:tc>
-          <w:tcPr>
-            <w:tcW w:w="3400" w:type="dxa"/>
-            <w:tcMar>
-              <w:top w:w="70" w:type="dxa"/>
-              <w:left w:w="100" w:type="dxa"/>
-              <w:bottom w:w="70" w:type="dxa"/>
-              <w:right w:w="100" w:type="dxa"/>
-            </w:tcMar>
-          </w:tcPr>
-          <w:p>
-            <w:r>
-              <w:rPr>
-                <w:sz w:val="18"/>
-                <w:szCs w:val="18"/>
-              </w:rPr>
-              <w:t xml:space="preserve">Super App — no Appro screen is opened</w:t>
-            </w:r>
-          </w:p>
-        </w:tc>
-        <w:tc>
-          <w:tcPr>
-            <w:tcW w:w="2940" w:type="dxa"/>
-            <w:tcMar>
-              <w:top w:w="70" w:type="dxa"/>
-              <w:left w:w="100" w:type="dxa"/>
-              <w:bottom w:w="70" w:type="dxa"/>
-              <w:right w:w="100" w:type="dxa"/>
-            </w:tcMar>
-          </w:tcPr>
-          <w:p>
-            <w:r>
-              <w:rPr>
-                <w:sz w:val="18"/>
-                <w:szCs w:val="18"/>
-              </w:rPr>
-              <w:t xml:space="preserve">—</w:t>
-            </w:r>
-          </w:p>
-        </w:tc>
-      </w:tr>
-      <w:tr>
-        <w:tblPrEx>
-          <w:tblCellMar>
-            <w:top w:w="0" w:type="dxa"/>
-            <w:bottom w:w="0" w:type="dxa"/>
-          </w:tblCellMar>
-        </w:tblPrEx>
-        <w:trPr>
-          <w:cantSplit/>
-        </w:trPr>
-        <w:tc>
-          <w:tcPr>
-            <w:tcW w:w="1250" w:type="dxa"/>
-            <w:tcMar>
-              <w:top w:w="70" w:type="dxa"/>
-              <w:left w:w="100" w:type="dxa"/>
-              <w:bottom w:w="70" w:type="dxa"/>
-              <w:right w:w="100" w:type="dxa"/>
-            </w:tcMar>
-          </w:tcPr>
-          <w:p>
-            <w:r>
-              <w:rPr>
-                <w:sz w:val="18"/>
-                <w:szCs w:val="18"/>
-              </w:rPr>
-              <w:t xml:space="preserve">P04</w:t>
-            </w:r>
-          </w:p>
-        </w:tc>
-        <w:tc>
-          <w:tcPr>
-            <w:tcW w:w="2050" w:type="dxa"/>
-            <w:tcMar>
-              <w:top w:w="70" w:type="dxa"/>
-              <w:left w:w="100" w:type="dxa"/>
-              <w:bottom w:w="70" w:type="dxa"/>
-              <w:right w:w="100" w:type="dxa"/>
-            </w:tcMar>
-          </w:tcPr>
-          <w:p>
-            <w:r>
-              <w:rPr>
-                <w:sz w:val="18"/>
-                <w:szCs w:val="18"/>
-              </w:rPr>
-              <w:t xml:space="preserve">APPRO_JOURNEY</w:t>
-            </w:r>
-          </w:p>
-        </w:tc>
-        <w:tc>
-          <w:tcPr>
-            <w:tcW w:w="3400" w:type="dxa"/>
-            <w:tcMar>
-              <w:top w:w="70" w:type="dxa"/>
-              <w:left w:w="100" w:type="dxa"/>
-              <w:bottom w:w="70" w:type="dxa"/>
-              <w:right w:w="100" w:type="dxa"/>
-            </w:tcMar>
-          </w:tcPr>
-          <w:p>
-            <w:r>
-              <w:rPr>
-                <w:sz w:val="18"/>
-                <w:szCs w:val="18"/>
-              </w:rPr>
-              <w:t xml:space="preserve">Application status screen</w:t>
-            </w:r>
-          </w:p>
-        </w:tc>
-        <w:tc>
-          <w:tcPr>
-            <w:tcW w:w="2940" w:type="dxa"/>
-            <w:tcMar>
-              <w:top w:w="70" w:type="dxa"/>
-              <w:left w:w="100" w:type="dxa"/>
-              <w:bottom w:w="70" w:type="dxa"/>
-              <w:right w:w="100" w:type="dxa"/>
-            </w:tcMar>
-          </w:tcPr>
-          <w:p>
-            <w:r>
-              <w:rPr>
-                <w:sz w:val="18"/>
-                <w:szCs w:val="18"/>
-              </w:rPr>
-              <w:t xml:space="preserve">Application status screen</w:t>
-            </w:r>
-          </w:p>
-        </w:tc>
-      </w:tr>
-      <w:tr>
-        <w:tblPrEx>
-          <w:tblCellMar>
-            <w:top w:w="0" w:type="dxa"/>
-            <w:bottom w:w="0" w:type="dxa"/>
-          </w:tblCellMar>
-        </w:tblPrEx>
-        <w:trPr>
-          <w:cantSplit/>
-        </w:trPr>
-        <w:tc>
-          <w:tcPr>
-            <w:tcW w:w="1250" w:type="dxa"/>
-            <w:tcMar>
-              <w:top w:w="70" w:type="dxa"/>
-              <w:left w:w="100" w:type="dxa"/>
-              <w:bottom w:w="70" w:type="dxa"/>
-              <w:right w:w="100" w:type="dxa"/>
-            </w:tcMar>
-          </w:tcPr>
-          <w:p>
-            <w:r>
-              <w:rPr>
-                <w:sz w:val="18"/>
-                <w:szCs w:val="18"/>
-              </w:rPr>
-              <w:t xml:space="preserve">P05</w:t>
-            </w:r>
-          </w:p>
-        </w:tc>
-        <w:tc>
-          <w:tcPr>
-            <w:tcW w:w="2050" w:type="dxa"/>
-            <w:tcMar>
-              <w:top w:w="70" w:type="dxa"/>
-              <w:left w:w="100" w:type="dxa"/>
-              <w:bottom w:w="70" w:type="dxa"/>
-              <w:right w:w="100" w:type="dxa"/>
-            </w:tcMar>
-          </w:tcPr>
-          <w:p>
-            <w:r>
-              <w:rPr>
-                <w:sz w:val="18"/>
-                <w:szCs w:val="18"/>
-              </w:rPr>
-              <w:t xml:space="preserve">APPRO_JOURNEY</w:t>
-            </w:r>
-          </w:p>
-        </w:tc>
-        <w:tc>
-          <w:tcPr>
-            <w:tcW w:w="3400" w:type="dxa"/>
-            <w:tcMar>
-              <w:top w:w="70" w:type="dxa"/>
-              <w:left w:w="100" w:type="dxa"/>
-              <w:bottom w:w="70" w:type="dxa"/>
-              <w:right w:w="100" w:type="dxa"/>
-            </w:tcMar>
-          </w:tcPr>
-          <w:p>
-            <w:r>
-              <w:rPr>
-                <w:sz w:val="18"/>
-                <w:szCs w:val="18"/>
-              </w:rPr>
-              <w:t xml:space="preserve">Document request screen</w:t>
-            </w:r>
-          </w:p>
-        </w:tc>
-        <w:tc>
-          <w:tcPr>
-            <w:tcW w:w="2940" w:type="dxa"/>
-            <w:tcMar>
-              <w:top w:w="70" w:type="dxa"/>
-              <w:left w:w="100" w:type="dxa"/>
-              <w:bottom w:w="70" w:type="dxa"/>
-              <w:right w:w="100" w:type="dxa"/>
-            </w:tcMar>
-          </w:tcPr>
-          <w:p>
-            <w:r>
-              <w:rPr>
-                <w:sz w:val="18"/>
-                <w:szCs w:val="18"/>
-              </w:rPr>
-              <w:t xml:space="preserve">Application status screen</w:t>
-            </w:r>
-          </w:p>
-        </w:tc>
-      </w:tr>
-      <w:tr>
-        <w:tblPrEx>
-          <w:tblCellMar>
-            <w:top w:w="0" w:type="dxa"/>
-            <w:bottom w:w="0" w:type="dxa"/>
-          </w:tblCellMar>
-        </w:tblPrEx>
-        <w:trPr>
-          <w:cantSplit/>
-        </w:trPr>
-        <w:tc>
-          <w:tcPr>
-            <w:tcW w:w="1250" w:type="dxa"/>
-            <w:tcMar>
-              <w:top w:w="70" w:type="dxa"/>
-              <w:left w:w="100" w:type="dxa"/>
-              <w:bottom w:w="70" w:type="dxa"/>
-              <w:right w:w="100" w:type="dxa"/>
-            </w:tcMar>
-          </w:tcPr>
-          <w:p>
-            <w:r>
-              <w:rPr>
-                <w:sz w:val="18"/>
-                <w:szCs w:val="18"/>
-              </w:rPr>
-              <w:t xml:space="preserve">P06</w:t>
-            </w:r>
-          </w:p>
-        </w:tc>
-        <w:tc>
-          <w:tcPr>
-            <w:tcW w:w="2050" w:type="dxa"/>
-            <w:tcMar>
-              <w:top w:w="70" w:type="dxa"/>
-              <w:left w:w="100" w:type="dxa"/>
-              <w:bottom w:w="70" w:type="dxa"/>
-              <w:right w:w="100" w:type="dxa"/>
-            </w:tcMar>
-          </w:tcPr>
-          <w:p>
-            <w:r>
-              <w:rPr>
-                <w:sz w:val="18"/>
-                <w:szCs w:val="18"/>
-              </w:rPr>
-              <w:t xml:space="preserve">APPRO_JOURNEY</w:t>
-            </w:r>
-          </w:p>
-        </w:tc>
-        <w:tc>
-          <w:tcPr>
-            <w:tcW w:w="3400" w:type="dxa"/>
-            <w:tcMar>
-              <w:top w:w="70" w:type="dxa"/>
-              <w:left w:w="100" w:type="dxa"/>
-              <w:bottom w:w="70" w:type="dxa"/>
-              <w:right w:w="100" w:type="dxa"/>
-            </w:tcMar>
-          </w:tcPr>
-          <w:p>
-            <w:r>
-              <w:rPr>
-                <w:sz w:val="18"/>
-                <w:szCs w:val="18"/>
-              </w:rPr>
-              <w:t xml:space="preserve">Offer review screen</w:t>
-            </w:r>
-          </w:p>
-        </w:tc>
-        <w:tc>
-          <w:tcPr>
-            <w:tcW w:w="2940" w:type="dxa"/>
-            <w:tcMar>
-              <w:top w:w="70" w:type="dxa"/>
-              <w:left w:w="100" w:type="dxa"/>
-              <w:bottom w:w="70" w:type="dxa"/>
-              <w:right w:w="100" w:type="dxa"/>
-            </w:tcMar>
-          </w:tcPr>
-          <w:p>
-            <w:r>
-              <w:rPr>
-                <w:sz w:val="18"/>
-                <w:szCs w:val="18"/>
-              </w:rPr>
-              <w:t xml:space="preserve">Application status screen</w:t>
-            </w:r>
-          </w:p>
-        </w:tc>
-      </w:tr>
-      <w:tr>
-        <w:tblPrEx>
-          <w:tblCellMar>
-            <w:top w:w="0" w:type="dxa"/>
-            <w:bottom w:w="0" w:type="dxa"/>
-          </w:tblCellMar>
-        </w:tblPrEx>
-        <w:trPr>
-          <w:cantSplit/>
-        </w:trPr>
-        <w:tc>
-          <w:tcPr>
-            <w:tcW w:w="1250" w:type="dxa"/>
-            <w:tcMar>
-              <w:top w:w="70" w:type="dxa"/>
-              <w:left w:w="100" w:type="dxa"/>
-              <w:bottom w:w="70" w:type="dxa"/>
-              <w:right w:w="100" w:type="dxa"/>
-            </w:tcMar>
-          </w:tcPr>
-          <w:p>
-            <w:r>
-              <w:rPr>
-                <w:sz w:val="18"/>
-                <w:szCs w:val="18"/>
-              </w:rPr>
-              <w:t xml:space="preserve">P08</w:t>
-            </w:r>
-          </w:p>
-        </w:tc>
-        <w:tc>
-          <w:tcPr>
-            <w:tcW w:w="2050" w:type="dxa"/>
-            <w:tcMar>
-              <w:top w:w="70" w:type="dxa"/>
-              <w:left w:w="100" w:type="dxa"/>
-              <w:bottom w:w="70" w:type="dxa"/>
-              <w:right w:w="100" w:type="dxa"/>
-            </w:tcMar>
-          </w:tcPr>
-          <w:p>
-            <w:r>
-              <w:rPr>
-                <w:sz w:val="18"/>
-                <w:szCs w:val="18"/>
-              </w:rPr>
-              <w:t xml:space="preserve">APPRO_JOURNEY</w:t>
-            </w:r>
-          </w:p>
-        </w:tc>
-        <w:tc>
-          <w:tcPr>
-            <w:tcW w:w="3400" w:type="dxa"/>
-            <w:tcMar>
-              <w:top w:w="70" w:type="dxa"/>
-              <w:left w:w="100" w:type="dxa"/>
-              <w:bottom w:w="70" w:type="dxa"/>
-              <w:right w:w="100" w:type="dxa"/>
-            </w:tcMar>
-          </w:tcPr>
-          <w:p>
-            <w:r>
-              <w:rPr>
-                <w:sz w:val="18"/>
-                <w:szCs w:val="18"/>
-              </w:rPr>
-              <w:t xml:space="preserve">Loan status screen</w:t>
-            </w:r>
-          </w:p>
-        </w:tc>
-        <w:tc>
-          <w:tcPr>
-            <w:tcW w:w="2940" w:type="dxa"/>
-            <w:tcMar>
-              <w:top w:w="70" w:type="dxa"/>
-              <w:left w:w="100" w:type="dxa"/>
-              <w:bottom w:w="70" w:type="dxa"/>
-              <w:right w:w="100" w:type="dxa"/>
-            </w:tcMar>
-          </w:tcPr>
-          <w:p>
-            <w:r>
-              <w:rPr>
-                <w:sz w:val="18"/>
-                <w:szCs w:val="18"/>
-              </w:rPr>
-              <w:t xml:space="preserve">Application status screen</w:t>
-            </w:r>
-          </w:p>
-        </w:tc>
-      </w:tr>
-      <w:tr>
-        <w:tblPrEx>
-          <w:tblCellMar>
-            <w:top w:w="0" w:type="dxa"/>
-            <w:bottom w:w="0" w:type="dxa"/>
-          </w:tblCellMar>
-        </w:tblPrEx>
-        <w:trPr>
-          <w:cantSplit/>
-        </w:trPr>
-        <w:tc>
-          <w:tcPr>
-            <w:tcW w:w="1250" w:type="dxa"/>
-            <w:tcMar>
-              <w:top w:w="70" w:type="dxa"/>
-              <w:left w:w="100" w:type="dxa"/>
-              <w:bottom w:w="70" w:type="dxa"/>
-              <w:right w:w="100" w:type="dxa"/>
-            </w:tcMar>
-          </w:tcPr>
-          <w:p>
-            <w:r>
-              <w:rPr>
-                <w:sz w:val="18"/>
-                <w:szCs w:val="18"/>
-              </w:rPr>
-              <w:t xml:space="preserve">P09</w:t>
-            </w:r>
-          </w:p>
-        </w:tc>
-        <w:tc>
-          <w:tcPr>
-            <w:tcW w:w="2050" w:type="dxa"/>
-            <w:tcMar>
-              <w:top w:w="70" w:type="dxa"/>
-              <w:left w:w="100" w:type="dxa"/>
-              <w:bottom w:w="70" w:type="dxa"/>
-              <w:right w:w="100" w:type="dxa"/>
-            </w:tcMar>
-          </w:tcPr>
-          <w:p>
-            <w:r>
-              <w:rPr>
-                <w:sz w:val="18"/>
-                <w:szCs w:val="18"/>
-              </w:rPr>
-              <w:t xml:space="preserve">NONE</w:t>
-            </w:r>
-          </w:p>
-        </w:tc>
-        <w:tc>
-          <w:tcPr>
-            <w:tcW w:w="3400" w:type="dxa"/>
-            <w:tcMar>
-              <w:top w:w="70" w:type="dxa"/>
-              <w:left w:w="100" w:type="dxa"/>
-              <w:bottom w:w="70" w:type="dxa"/>
-              <w:right w:w="100" w:type="dxa"/>
-            </w:tcMar>
-          </w:tcPr>
-          <w:p>
-            <w:r>
-              <w:rPr>
-                <w:sz w:val="18"/>
-                <w:szCs w:val="18"/>
-              </w:rPr>
-              <w:t xml:space="preserve">Super App — no Appro screen is opened</w:t>
-            </w:r>
-          </w:p>
-        </w:tc>
-        <w:tc>
-          <w:tcPr>
-            <w:tcW w:w="2940" w:type="dxa"/>
-            <w:tcMar>
-              <w:top w:w="70" w:type="dxa"/>
-              <w:left w:w="100" w:type="dxa"/>
-              <w:bottom w:w="70" w:type="dxa"/>
-              <w:right w:w="100" w:type="dxa"/>
-            </w:tcMar>
-          </w:tcPr>
-          <w:p>
-            <w:r>
-              <w:rPr>
-                <w:sz w:val="18"/>
-                <w:szCs w:val="18"/>
-              </w:rPr>
-              <w:t xml:space="preserve">—</w:t>
-            </w:r>
-          </w:p>
-        </w:tc>
-      </w:tr>
-      <w:tr>
-        <w:tblPrEx>
-          <w:tblCellMar>
-            <w:top w:w="0" w:type="dxa"/>
-            <w:bottom w:w="0" w:type="dxa"/>
-          </w:tblCellMar>
-        </w:tblPrEx>
-        <w:trPr>
-          <w:cantSplit/>
-        </w:trPr>
-        <w:tc>
-          <w:tcPr>
-            <w:tcW w:w="1250" w:type="dxa"/>
-            <w:tcMar>
-              <w:top w:w="70" w:type="dxa"/>
-              <w:left w:w="100" w:type="dxa"/>
-              <w:bottom w:w="70" w:type="dxa"/>
-              <w:right w:w="100" w:type="dxa"/>
-            </w:tcMar>
-          </w:tcPr>
-          <w:p>
-            <w:r>
-              <w:rPr>
-                <w:sz w:val="18"/>
-                <w:szCs w:val="18"/>
-              </w:rPr>
-              <w:t xml:space="preserve">P10</w:t>
-            </w:r>
-          </w:p>
-        </w:tc>
-        <w:tc>
-          <w:tcPr>
-            <w:tcW w:w="2050" w:type="dxa"/>
-            <w:tcMar>
-              <w:top w:w="70" w:type="dxa"/>
-              <w:left w:w="100" w:type="dxa"/>
-              <w:bottom w:w="70" w:type="dxa"/>
-              <w:right w:w="100" w:type="dxa"/>
-            </w:tcMar>
-          </w:tcPr>
-          <w:p>
-            <w:r>
-              <w:rPr>
-                <w:sz w:val="18"/>
-                <w:szCs w:val="18"/>
-              </w:rPr>
-              <w:t xml:space="preserve">APPRO_JOURNEY</w:t>
-            </w:r>
-          </w:p>
-        </w:tc>
-        <w:tc>
-          <w:tcPr>
-            <w:tcW w:w="3400" w:type="dxa"/>
-            <w:tcMar>
-              <w:top w:w="70" w:type="dxa"/>
-              <w:left w:w="100" w:type="dxa"/>
-              <w:bottom w:w="70" w:type="dxa"/>
-              <w:right w:w="100" w:type="dxa"/>
-            </w:tcMar>
-          </w:tcPr>
-          <w:p>
-            <w:r>
-              <w:rPr>
-                <w:sz w:val="18"/>
-                <w:szCs w:val="18"/>
-              </w:rPr>
-              <w:t xml:space="preserve">Loan status screen</w:t>
-            </w:r>
-          </w:p>
-        </w:tc>
-        <w:tc>
-          <w:tcPr>
-            <w:tcW w:w="2940" w:type="dxa"/>
-            <w:tcMar>
-              <w:top w:w="70" w:type="dxa"/>
-              <w:left w:w="100" w:type="dxa"/>
-              <w:bottom w:w="70" w:type="dxa"/>
-              <w:right w:w="100" w:type="dxa"/>
-            </w:tcMar>
-          </w:tcPr>
-          <w:p>
-            <w:r>
-              <w:rPr>
-                <w:sz w:val="18"/>
-                <w:szCs w:val="18"/>
-              </w:rPr>
-              <w:t xml:space="preserve">Application status screen</w:t>
-            </w:r>
-          </w:p>
-        </w:tc>
-      </w:tr>
-      <w:tr>
-        <w:tblPrEx>
-          <w:tblCellMar>
-            <w:top w:w="0" w:type="dxa"/>
-            <w:bottom w:w="0" w:type="dxa"/>
-          </w:tblCellMar>
-        </w:tblPrEx>
-        <w:trPr>
-          <w:cantSplit/>
-        </w:trPr>
-        <w:tc>
-          <w:tcPr>
-            <w:tcW w:w="1250" w:type="dxa"/>
-            <w:tcMar>
-              <w:top w:w="70" w:type="dxa"/>
-              <w:left w:w="100" w:type="dxa"/>
-              <w:bottom w:w="70" w:type="dxa"/>
-              <w:right w:w="100" w:type="dxa"/>
-            </w:tcMar>
-          </w:tcPr>
-          <w:p>
-            <w:r>
-              <w:rPr>
-                <w:sz w:val="18"/>
-                <w:szCs w:val="18"/>
-              </w:rPr>
-              <w:t xml:space="preserve">P11</w:t>
-            </w:r>
-          </w:p>
-        </w:tc>
-        <w:tc>
-          <w:tcPr>
-            <w:tcW w:w="2050" w:type="dxa"/>
-            <w:tcMar>
-              <w:top w:w="70" w:type="dxa"/>
-              <w:left w:w="100" w:type="dxa"/>
-              <w:bottom w:w="70" w:type="dxa"/>
-              <w:right w:w="100" w:type="dxa"/>
-            </w:tcMar>
-          </w:tcPr>
-          <w:p>
-            <w:r>
-              <w:rPr>
-                <w:sz w:val="18"/>
-                <w:szCs w:val="18"/>
-              </w:rPr>
-              <w:t xml:space="preserve">APPRO_JOURNEY</w:t>
-            </w:r>
-          </w:p>
-        </w:tc>
-        <w:tc>
-          <w:tcPr>
-            <w:tcW w:w="3400" w:type="dxa"/>
-            <w:tcMar>
-              <w:top w:w="70" w:type="dxa"/>
-              <w:left w:w="100" w:type="dxa"/>
-              <w:bottom w:w="70" w:type="dxa"/>
-              <w:right w:w="100" w:type="dxa"/>
-            </w:tcMar>
-          </w:tcPr>
-          <w:p>
-            <w:r>
-              <w:rPr>
-                <w:sz w:val="18"/>
-                <w:szCs w:val="18"/>
-              </w:rPr>
-              <w:t xml:space="preserve">Application status screen</w:t>
-            </w:r>
-          </w:p>
-        </w:tc>
-        <w:tc>
-          <w:tcPr>
-            <w:tcW w:w="2940" w:type="dxa"/>
-            <w:tcMar>
-              <w:top w:w="70" w:type="dxa"/>
-              <w:left w:w="100" w:type="dxa"/>
-              <w:bottom w:w="70" w:type="dxa"/>
-              <w:right w:w="100" w:type="dxa"/>
-            </w:tcMar>
-          </w:tcPr>
-          <w:p>
-            <w:r>
-              <w:rPr>
-                <w:sz w:val="18"/>
-                <w:szCs w:val="18"/>
-              </w:rPr>
-              <w:t xml:space="preserve">Application status screen</w:t>
-            </w:r>
-          </w:p>
-        </w:tc>
-      </w:tr>
-    </w:tbl>
-    <w:p>
-      <w:pPr>
-        <w:spacing w:after="130"/>
-      </w:pPr>
-      <w:r>
-        <w:rPr>
-          <w:b/>
-          <w:bCs/>
-          <w:color w:val="C00000"/>
-        </w:rPr>
-        <w:t xml:space="preserve">The Super App hand-over of action.id and action.value to the Appro journey, and keeping the destination through the login — TBC by Avanza.</w:t>
-      </w:r>
-    </w:p>
-    <w:p>
-      <w:pPr>
-        <w:pStyle w:val="Heading2"/>
-      </w:pPr>
-      <w:r>
-        <w:t xml:space="preserve">3.5 Device and session scenarios</w:t>
+        <w:t xml:space="preserve">3.4 Device and session scenarios</w:t>
       </w:r>
     </w:p>
     <w:p>
@@ -4739,7 +3556,7 @@
                 <w:sz w:val="18"/>
                 <w:szCs w:val="18"/>
               </w:rPr>
-              <w:t xml:space="preserve">The Super App completes the login first, then opens the destination screen of section 3.4.</w:t>
+              <w:t xml:space="preserve">The Super App completes the login first, then opens the Appro journey at the screen for the event.</w:t>
             </w:r>
           </w:p>
         </w:tc>
@@ -5023,7 +3840,7 @@
                 <w:sz w:val="18"/>
                 <w:szCs w:val="18"/>
               </w:rPr>
-              <w:t xml:space="preserve">No further push is sent and reminders stop immediately (section 3.6). On a late tap, the journey opens the application status screen (section 3.4).</w:t>
+              <w:t xml:space="preserve">No further push is sent and reminders stop immediately (section 3.5). On a late tap, the journey opens the application status screen.</w:t>
             </w:r>
           </w:p>
         </w:tc>
@@ -5105,7 +3922,7 @@
         <w:pStyle w:val="Heading2"/>
       </w:pPr>
       <w:r>
-        <w:t xml:space="preserve">3.6 Reminder and stop rules (P02)</w:t>
+        <w:t xml:space="preserve">3.5 Reminder and stop rules (P02)</w:t>
       </w:r>
     </w:p>
     <w:p>
@@ -5152,7 +3969,7 @@
         <w:pStyle w:val="Heading2"/>
       </w:pPr>
       <w:r>
-        <w:t xml:space="preserve">3.7 Sending time</w:t>
+        <w:t xml:space="preserve">3.6 Sending time</w:t>
       </w:r>
     </w:p>
     <w:p>
@@ -6828,7 +5645,7 @@
                 <w:sz w:val="18"/>
                 <w:szCs w:val="18"/>
               </w:rPr>
-              <w:t xml:space="preserve">APPRO_JOURNEY: a tap opens the Appro journey (section 3.4). NONE: no forced action — the tap opens the Super App; used for P03 and P09 (call of 05/10). POPUP: not used by Appro. </w:t>
+              <w:t xml:space="preserve">APPRO_JOURNEY: a tap opens the Appro journey at the screen for the event. NONE: no forced action — the tap opens the Super App; used for P03 and P09 (call of 05/10). POPUP: not used by Appro. </w:t>
             </w:r>
             <w:r>
               <w:rPr>
@@ -8806,7 +7623,7 @@
           <w:b/>
           <w:bCs/>
         </w:rPr>
-        <w:t xml:space="preserve">5 minutes</w:t>
+        <w:t>X minutes</w:t>
       </w:r>
       <w:r>
         <w:t xml:space="preserve">, up to </w:t>
@@ -8816,7 +7633,7 @@
           <w:b/>
           <w:bCs/>
         </w:rPr>
-        <w:t xml:space="preserve">3 attempts</w:t>
+        <w:t>N attempts</w:t>
       </w:r>
       <w:r>
         <w:t xml:space="preserve">. The interval and the number of attempts are backend configuration parameters.</w:t>
@@ -8877,23 +7694,23 @@
       <w:pPr>
         <w:pStyle w:val="ListParagraph"/>
         <w:numPr>
-          <w:ilvl w:val="0"/>
+          <w:ilvl w:val="1"/>
           <w:numId w:val="1"/>
         </w:numPr>
         <w:spacing w:after="70"/>
-      </w:pPr>
-      <w:r>
-        <w:t xml:space="preserve">If the push is still not successful after the last attempt → tracked in the backend as </w:t>
-      </w:r>
-      <w:r>
         <w:rPr>
           <w:b/>
           <w:bCs/>
+          <w:color w:val="C00000"/>
         </w:rPr>
-        <w:t>Failed</w:t>
-      </w:r>
-      <w:r>
-        <w:t xml:space="preserve"> → the journey proceeds. A push failure must not block, delay or change the application status.</w:t>
+      </w:pPr>
+      <w:r>
+        <w:rPr>
+          <w:b/>
+          <w:bCs/>
+          <w:color w:val="C00000"/>
+        </w:rPr>
+        <w:t xml:space="preserve">Retry interval (X) and number of attempts (N) – To be confirmed by RB Business</w:t>
       </w:r>
     </w:p>
     <w:p>
@@ -8906,10 +7723,33 @@
         <w:spacing w:after="70"/>
       </w:pPr>
       <w:r>
+        <w:t xml:space="preserve">If the push is still not successful after the last attempt → tracked in the backend as </w:t>
+      </w:r>
+      <w:r>
+        <w:rPr>
+          <w:b/>
+          <w:bCs/>
+        </w:rPr>
+        <w:t>Failed</w:t>
+      </w:r>
+      <w:r>
+        <w:t xml:space="preserve"> → the journey proceeds. A push failure must not block, delay or change the application status.</w:t>
+      </w:r>
+    </w:p>
+    <w:p>
+      <w:pPr>
+        <w:pStyle w:val="ListParagraph"/>
+        <w:numPr>
+          <w:ilvl w:val="0"/>
+          <w:numId w:val="1"/>
+        </w:numPr>
+        <w:spacing w:after="70"/>
+      </w:pPr>
+      <w:r>
         <w:t xml:space="preserve">The system tracks the API delivery result only, in the backend; it is not shown in the Super Portal audit trail. Customer actions on the notification (open, dismiss, ignore) are not tracked.</w:t>
       </w:r>
       <w:r>
-        <w:t xml:space="preserve"> The backend record per push: Push ID, date and time, number of attempts, final status (Success / Failed) and the failure reason. Until a Super Portal view is available (section 9), Appro support provides the status of a push for a given application on request from the Contact Centre.</w:t>
+        <w:t xml:space="preserve"> The backend record per push: Push ID, date and time, number of attempts, final status (Success / Failed) and the failure reason. Until a Super Portal view is available (section 8), Appro support provides the status of a push for a given application on request from the Contact Centre.</w:t>
       </w:r>
     </w:p>
     <w:p>
@@ -8975,7 +7815,7 @@
           <w:sz w:val="17"/>
           <w:szCs w:val="17"/>
         </w:rPr>
-        <w:t xml:space="preserve">Figure 2 — Response handling and automatic retry (default: retry every 5 minutes, up to 3 attempts)</w:t>
+        <w:t xml:space="preserve">Figure 2 — Response handling and automatic retry (X and N configurable)</w:t>
       </w:r>
     </w:p>
     <w:p>
@@ -9857,7 +8697,7 @@
                 <w:sz w:val="18"/>
                 <w:szCs w:val="18"/>
               </w:rPr>
-              <w:t xml:space="preserve">No change in this release. Push results are tracked in the backend only; Appro support provides the status of a push on request (section 5). A Super Portal view is a post-MVP enhancement (section 9).</w:t>
+              <w:t xml:space="preserve">No change in this release. Push results are tracked in the backend only; Appro support provides the status of a push on request (section 5). A Super Portal view is a post-MVP enhancement (section 8).</w:t>
             </w:r>
           </w:p>
         </w:tc>
@@ -10086,209 +8926,9 @@
       <w:bookmarkStart w:id="914" w:name="sec14"/>
       <w:r>
         <w:lastRenderedPageBreak/>
-        <w:t xml:space="preserve">8. ACCEPTANCE CRITERIA (UAT)</w:t>
+        <w:t xml:space="preserve">8. FUTURE ENHANCEMENTS (POST-MVP)</w:t>
       </w:r>
       <w:bookmarkEnd w:id="914"/>
-    </w:p>
-    <w:p>
-      <w:pPr>
-        <w:spacing w:after="130"/>
-      </w:pPr>
-      <w:r>
-        <w:t xml:space="preserve">UAT passes when the criteria below hold; the detailed test cases follow in the UAT plan. The second group is executed end to end with Avanza, because the behaviour sits in the Super App or the middleware.</w:t>
-      </w:r>
-    </w:p>
-    <w:p>
-      <w:pPr>
-        <w:spacing w:after="130"/>
-      </w:pPr>
-      <w:r>
-        <w:rPr>
-          <w:b/>
-          <w:bCs/>
-        </w:rPr>
-        <w:t xml:space="preserve">Verified on the Appro platform</w:t>
-      </w:r>
-    </w:p>
-    <w:p>
-      <w:pPr>
-        <w:pStyle w:val="ListParagraph"/>
-        <w:numPr>
-          <w:ilvl w:val="0"/>
-          <w:numId w:val="1"/>
-        </w:numPr>
-        <w:spacing w:after="70"/>
-      </w:pPr>
-      <w:r>
-        <w:t xml:space="preserve">Each push fires at its trigger event only, for the right product, customer and language, with the exact title and body of section 3.1 — and never for a completed, cancelled, rejected or expired application.</w:t>
-      </w:r>
-    </w:p>
-    <w:p>
-      <w:pPr>
-        <w:pStyle w:val="ListParagraph"/>
-        <w:numPr>
-          <w:ilvl w:val="0"/>
-          <w:numId w:val="1"/>
-        </w:numPr>
-        <w:spacing w:after="70"/>
-      </w:pPr>
-      <w:r>
-        <w:t xml:space="preserve">A tap opens the destination screen of section 3.4, on iOS and Android.</w:t>
-      </w:r>
-    </w:p>
-    <w:p>
-      <w:pPr>
-        <w:pStyle w:val="ListParagraph"/>
-        <w:numPr>
-          <w:ilvl w:val="0"/>
-          <w:numId w:val="1"/>
-        </w:numPr>
-        <w:spacing w:after="70"/>
-      </w:pPr>
-      <w:r>
-        <w:t xml:space="preserve">Arabic content renders correctly, and no personal data appears in any title or body (BR2).</w:t>
-      </w:r>
-    </w:p>
-    <w:p>
-      <w:pPr>
-        <w:pStyle w:val="ListParagraph"/>
-        <w:numPr>
-          <w:ilvl w:val="0"/>
-          <w:numId w:val="1"/>
-        </w:numPr>
-        <w:spacing w:after="70"/>
-      </w:pPr>
-      <w:r>
-        <w:t xml:space="preserve">A failed call is retried every 5 minutes up to 3 attempts; 403 and 404 are not retried; the final failure is tracked with its reason (sections 4.5 and 5).</w:t>
-      </w:r>
-    </w:p>
-    <w:p>
-      <w:pPr>
-        <w:pStyle w:val="ListParagraph"/>
-        <w:numPr>
-          <w:ilvl w:val="0"/>
-          <w:numId w:val="1"/>
-        </w:numPr>
-        <w:spacing w:after="70"/>
-      </w:pPr>
-      <w:r>
-        <w:t xml:space="preserve">No duplicate notification for one event — including on retry, timeout or reprocessing (BR5).</w:t>
-      </w:r>
-    </w:p>
-    <w:p>
-      <w:pPr>
-        <w:pStyle w:val="ListParagraph"/>
-        <w:numPr>
-          <w:ilvl w:val="0"/>
-          <w:numId w:val="1"/>
-        </w:numPr>
-        <w:spacing w:after="70"/>
-      </w:pPr>
-      <w:r>
-        <w:t xml:space="preserve">P02 stops immediately on every stop condition of section 3.6; scheduled pushes respect the 10:00 sending time (section 3.7).</w:t>
-      </w:r>
-    </w:p>
-    <w:p>
-      <w:pPr>
-        <w:pStyle w:val="ListParagraph"/>
-        <w:numPr>
-          <w:ilvl w:val="0"/>
-          <w:numId w:val="1"/>
-        </w:numPr>
-        <w:spacing w:after="70"/>
-      </w:pPr>
-      <w:r>
-        <w:t xml:space="preserve">A push failure never blocks, delays or changes the application (section 5).</w:t>
-      </w:r>
-    </w:p>
-    <w:p>
-      <w:pPr>
-        <w:pStyle w:val="ListParagraph"/>
-        <w:numPr>
-          <w:ilvl w:val="0"/>
-          <w:numId w:val="1"/>
-        </w:numPr>
-        <w:spacing w:after="70"/>
-      </w:pPr>
-      <w:r>
-        <w:t xml:space="preserve">The backend record is complete per section 5 for every sent and failed push.</w:t>
-      </w:r>
-    </w:p>
-    <w:p>
-      <w:pPr>
-        <w:spacing w:after="130"/>
-      </w:pPr>
-      <w:r>
-        <w:rPr>
-          <w:b/>
-          <w:bCs/>
-        </w:rPr>
-        <w:t xml:space="preserve">Verified end to end with Avanza</w:t>
-      </w:r>
-    </w:p>
-    <w:p>
-      <w:pPr>
-        <w:pStyle w:val="ListParagraph"/>
-        <w:numPr>
-          <w:ilvl w:val="0"/>
-          <w:numId w:val="1"/>
-        </w:numPr>
-        <w:spacing w:after="70"/>
-      </w:pPr>
-      <w:r>
-        <w:t xml:space="preserve">Delivery on iOS and Android through the Super App.</w:t>
-      </w:r>
-    </w:p>
-    <w:p>
-      <w:pPr>
-        <w:pStyle w:val="ListParagraph"/>
-        <w:numPr>
-          <w:ilvl w:val="0"/>
-          <w:numId w:val="1"/>
-        </w:numPr>
-        <w:spacing w:after="70"/>
-      </w:pPr>
-      <w:r>
-        <w:t xml:space="preserve">Notification permission disabled, invalid or expired token, changed device, multiple devices (section 3.5).</w:t>
-      </w:r>
-    </w:p>
-    <w:p>
-      <w:pPr>
-        <w:pStyle w:val="ListParagraph"/>
-        <w:numPr>
-          <w:ilvl w:val="0"/>
-          <w:numId w:val="1"/>
-        </w:numPr>
-        <w:spacing w:after="70"/>
-      </w:pPr>
-      <w:r>
-        <w:t xml:space="preserve">Logged-out tap: login first, then the destination screen of section 3.4.</w:t>
-      </w:r>
-    </w:p>
-    <w:p>
-      <w:pPr>
-        <w:pStyle w:val="ListParagraph"/>
-        <w:numPr>
-          <w:ilvl w:val="0"/>
-          <w:numId w:val="1"/>
-        </w:numPr>
-        <w:spacing w:after="70"/>
-      </w:pPr>
-      <w:r>
-        <w:t xml:space="preserve">P03 and P09 (action type NONE) open the Super App only.</w:t>
-      </w:r>
-    </w:p>
-    <w:p>
-      <w:pPr>
-        <w:pStyle w:val="Heading1"/>
-        <w:pageBreakBefore/>
-      </w:pPr>
-      <w:bookmarkStart w:id="915" w:name="sec15"/>
-      <w:r>
-        <w:lastRenderedPageBreak/>
-        <w:t xml:space="preserve">9. FUTURE ENHANCEMENTS (POST-MVP)</w:t>
-      </w:r>
-      <w:bookmarkEnd w:id="915"/>
     </w:p>
     <w:p>
       <w:pPr>

</xml_diff>

<commit_message>
BRD V1.2: tap flow shows Super App login and the two outcomes
Figure 1 adds the Super App login step after the tap and branches to
the two outcomes: the Appro journey resumes at the screen where the
application continues (Resume screen), or the customer stays in the
Super App, depending on the event. The intro paragraph and key step 5
carry the same sentence. Section 1 now splits cleanly over two pages
(Key steps starts page 4); the image frame extent follows the taller
figure. 13 pages, landscape table on page 6.

Co-Authored-By: Claude Fable 5 <noreply@anthropic.com>
Claude-Session: https://claude.ai/code/session_01Gsr2gRNUjiFkvLbYu9J5cW
</commit_message>
<xml_diff>
--- a/docs/brd/push_notification/BRD_Push_Notification_V1.2.docx
+++ b/docs/brd/push_notification/BRD_Push_Notification_V1.2.docx
@@ -666,7 +666,7 @@
       </w:hyperlink>
       <w:r>
         <w:tab/>
-        <w:t>4</w:t>
+        <w:t>5</w:t>
       </w:r>
     </w:p>
     <w:p>
@@ -683,7 +683,7 @@
       </w:hyperlink>
       <w:r>
         <w:tab/>
-        <w:t>5</w:t>
+        <w:t>6</w:t>
       </w:r>
     </w:p>
     <w:p>
@@ -700,7 +700,7 @@
       </w:hyperlink>
       <w:r>
         <w:tab/>
-        <w:t>6</w:t>
+        <w:t>7</w:t>
       </w:r>
     </w:p>
     <w:p>
@@ -717,7 +717,7 @@
       </w:hyperlink>
       <w:r>
         <w:tab/>
-        <w:t>9</w:t>
+        <w:t>10</w:t>
       </w:r>
     </w:p>
     <w:p>
@@ -734,7 +734,7 @@
       </w:hyperlink>
       <w:r>
         <w:tab/>
-        <w:t>9</w:t>
+        <w:t>10</w:t>
       </w:r>
     </w:p>
     <w:p>
@@ -751,7 +751,7 @@
       </w:hyperlink>
       <w:r>
         <w:tab/>
-        <w:t>10</w:t>
+        <w:t>11</w:t>
       </w:r>
     </w:p>
     <w:p>
@@ -768,7 +768,7 @@
       </w:hyperlink>
       <w:r>
         <w:tab/>
-        <w:t>11</w:t>
+        <w:t>12</w:t>
       </w:r>
     </w:p>
     <w:p>
@@ -785,7 +785,7 @@
       </w:hyperlink>
       <w:r>
         <w:tab/>
-        <w:t>12</w:t>
+        <w:t>13</w:t>
       </w:r>
     </w:p>
     <w:p>
@@ -851,7 +851,7 @@
         <w:spacing w:after="130"/>
       </w:pPr>
       <w:r>
-        <w:t>Push Notification adds a device-level alert at each agreed trigger event. The Appro platform sends the push request to the Reem Bank middleware Push API, following the same integration pattern as the existing SMS and email integration. When the customer taps the notification, the Appro journey opens at the screen where the application continues.</w:t>
+        <w:t xml:space="preserve">Push Notification adds a device-level alert at each agreed trigger event. The Appro platform sends the push request to the Reem Bank middleware Push API, following the same integration pattern as the existing SMS and email integration. When the customer taps the notification, the customer is navigated to the Super App login screen, and the Appro journey opens at the screen where the application continues (Resume screen) or the Super App, depending on the event.</w:t>
       </w:r>
     </w:p>
     <w:p>
@@ -971,7 +971,7 @@
         </w:rPr>
         <w:drawing>
           <wp:inline distT="0" distB="0" distL="0" distR="0" wp14:anchorId="14B854A8" wp14:editId="7E947BCE">
-            <wp:extent cx="6096000" cy="1657350"/>
+            <wp:extent cx="6096000" cy="2370667"/>
             <wp:effectExtent l="0" t="0" r="0" b="0"/>
             <wp:docPr id="1358791531" name="Picture 1358791531"/>
             <wp:cNvGraphicFramePr>
@@ -996,7 +996,7 @@
                   <pic:spPr bwMode="auto">
                     <a:xfrm>
                       <a:off x="0" y="0"/>
-                      <a:ext cx="6096000" cy="1657350"/>
+                      <a:ext cx="6096000" cy="2370667"/>
                     </a:xfrm>
                     <a:prstGeom prst="rect">
                       <a:avLst/>
@@ -1027,6 +1027,7 @@
     </w:p>
     <w:p>
       <w:pPr>
+        <w:pageBreakBefore/>
         <w:keepNext/>
         <w:spacing w:after="60"/>
       </w:pPr>
@@ -1100,7 +1101,7 @@
         <w:spacing w:after="70"/>
       </w:pPr>
       <w:r>
-        <w:t>The customer taps the notification, and the Appro journey opens at the screen for that event.</w:t>
+        <w:t xml:space="preserve">The customer taps the notification and is navigated to the Super App login screen; after login, the Appro journey opens at the screen where the application continues (Resume screen) or the Super App, depending on the event.</w:t>
       </w:r>
     </w:p>
     <w:p>

</xml_diff>

<commit_message>
Push notification: resolve the terminal-status suppression conflict
Fadel's follow-up: section 3.4 read as "no push for rejected/expired/
completed applications" while P03/P04/P11 announce exactly those
outcomes. Clarified in the BRD: the outcome notification for a terminal
event is sent once; the P02 reminders and any further push stop after
it; the customer rejecting the offer is an explicit stop condition.
Reply added to the response email as item 16.

Co-Authored-By: Claude Fable 5 <noreply@anthropic.com>
Claude-Session: https://claude.ai/code/session_01Gsr2gRNUjiFkvLbYu9J5cW
</commit_message>
<xml_diff>
--- a/docs/brd/push_notification/BRD_Push_Notification_V1.2.docx
+++ b/docs/brd/push_notification/BRD_Push_Notification_V1.2.docx
@@ -700,7 +700,7 @@
       </w:hyperlink>
       <w:r>
         <w:tab/>
-        <w:t>7</w:t>
+        <w:t>8</w:t>
       </w:r>
     </w:p>
     <w:p>
@@ -717,7 +717,7 @@
       </w:hyperlink>
       <w:r>
         <w:tab/>
-        <w:t>10</w:t>
+        <w:t>11</w:t>
       </w:r>
     </w:p>
     <w:p>
@@ -734,7 +734,7 @@
       </w:hyperlink>
       <w:r>
         <w:tab/>
-        <w:t>10</w:t>
+        <w:t>11</w:t>
       </w:r>
     </w:p>
     <w:p>
@@ -751,7 +751,7 @@
       </w:hyperlink>
       <w:r>
         <w:tab/>
-        <w:t>11</w:t>
+        <w:t>12</w:t>
       </w:r>
     </w:p>
     <w:p>
@@ -768,7 +768,7 @@
       </w:hyperlink>
       <w:r>
         <w:tab/>
-        <w:t>12</w:t>
+        <w:t>13</w:t>
       </w:r>
     </w:p>
     <w:p>
@@ -785,7 +785,7 @@
       </w:hyperlink>
       <w:r>
         <w:tab/>
-        <w:t>13</w:t>
+        <w:t>14</w:t>
       </w:r>
     </w:p>
     <w:p>
@@ -3841,7 +3841,7 @@
                 <w:sz w:val="18"/>
                 <w:szCs w:val="18"/>
               </w:rPr>
-              <w:t xml:space="preserve">No further push is sent and reminders stop immediately (section 3.5). On a late tap, the journey opens the application status screen.</w:t>
+              <w:t xml:space="preserve">The outcome notification for the event itself is sent once (e.g. P03 offer expired, P04 application update, P11 product ready). After the terminal status, the P02 reminders stop immediately and no further push is sent for the application (section 3.5). On a late tap, the journey opens the application status screen.</w:t>
             </w:r>
           </w:p>
         </w:tc>
@@ -3949,7 +3949,20 @@
         <w:spacing w:after="70"/>
       </w:pPr>
       <w:r>
-        <w:t xml:space="preserve">P02 stops immediately when the customer selects an offer, or when the application is completed, cancelled or withdrawn, rejected or expired, or the product is booked or issued.</w:t>
+        <w:t xml:space="preserve">P02 stops immediately when the customer selects or rejects the offer, or when the application is completed, cancelled or withdrawn, rejected or expired, or the product is booked or issued.</w:t>
+      </w:r>
+    </w:p>
+    <w:p>
+      <w:pPr>
+        <w:pStyle w:val="ListParagraph"/>
+        <w:numPr>
+          <w:ilvl w:val="0"/>
+          <w:numId w:val="1"/>
+        </w:numPr>
+        <w:spacing w:after="70"/>
+      </w:pPr>
+      <w:r>
+        <w:t xml:space="preserve">A terminal status still sends its own outcome notification once — P03 (offer expired), P04 (application update), P11 (product ready). The stop rules apply to the reminders and to any further push after that notification.</w:t>
       </w:r>
     </w:p>
     <w:p>

</xml_diff>